<commit_message>
Reorganize assets and add SQL script for Experiment 1
Moved image assets from the 'assets' folder to the root of Experiment_1, added a new image (7.png), and included Exp1.2_24BAI70427.sql with sample SQL queries. Updated Experiment_1.docx
</commit_message>
<xml_diff>
--- a/Experiment_1/Experiment_1.docx
+++ b/Experiment_1/Experiment_1.docx
@@ -390,7 +390,7 @@
           <w:kern w:val="0"/>
           <w14:ligatures w14:val="none"/>
         </w:rPr>
-        <w:t>Implementation Procedure</w:t>
+        <w:t>Practical/Experiment Steps</w:t>
       </w:r>
     </w:p>
     <w:p>
@@ -653,19 +653,8 @@
           <w:kern w:val="0"/>
           <w14:ligatures w14:val="none"/>
         </w:rPr>
-        <w:t xml:space="preserve">CREATE TABLE </w:t>
-      </w:r>
-      <w:proofErr w:type="gramStart"/>
-      <w:r>
-        <w:rPr>
-          <w:rFonts w:ascii="Times New Roman" w:eastAsia="Times New Roman" w:hAnsi="Times New Roman" w:cs="Times New Roman"/>
-          <w:bCs/>
-          <w:kern w:val="0"/>
-          <w14:ligatures w14:val="none"/>
-        </w:rPr>
-        <w:t>BOOKS(</w:t>
-      </w:r>
-      <w:proofErr w:type="gramEnd"/>
+        <w:t>CREATE TABLE BOOKS(</w:t>
+      </w:r>
     </w:p>
     <w:p>
       <w:pPr>
@@ -704,27 +693,7 @@
           <w14:ligatures w14:val="none"/>
         </w:rPr>
         <w:tab/>
-        <w:t xml:space="preserve">BOOK_NAME </w:t>
-      </w:r>
-      <w:proofErr w:type="gramStart"/>
-      <w:r>
-        <w:rPr>
-          <w:rFonts w:ascii="Times New Roman" w:eastAsia="Times New Roman" w:hAnsi="Times New Roman" w:cs="Times New Roman"/>
-          <w:bCs/>
-          <w:kern w:val="0"/>
-          <w14:ligatures w14:val="none"/>
-        </w:rPr>
-        <w:t>VARCHAR(</w:t>
-      </w:r>
-      <w:proofErr w:type="gramEnd"/>
-      <w:r>
-        <w:rPr>
-          <w:rFonts w:ascii="Times New Roman" w:eastAsia="Times New Roman" w:hAnsi="Times New Roman" w:cs="Times New Roman"/>
-          <w:bCs/>
-          <w:kern w:val="0"/>
-          <w14:ligatures w14:val="none"/>
-        </w:rPr>
-        <w:t>20) NOT NULL,</w:t>
+        <w:t>BOOK_NAME VARCHAR(20) NOT NULL,</w:t>
       </w:r>
     </w:p>
     <w:p>
@@ -744,27 +713,7 @@
           <w14:ligatures w14:val="none"/>
         </w:rPr>
         <w:tab/>
-        <w:t xml:space="preserve">AUTHOR_NAME </w:t>
-      </w:r>
-      <w:proofErr w:type="gramStart"/>
-      <w:r>
-        <w:rPr>
-          <w:rFonts w:ascii="Times New Roman" w:eastAsia="Times New Roman" w:hAnsi="Times New Roman" w:cs="Times New Roman"/>
-          <w:bCs/>
-          <w:kern w:val="0"/>
-          <w14:ligatures w14:val="none"/>
-        </w:rPr>
-        <w:t>VARCHAR(</w:t>
-      </w:r>
-      <w:proofErr w:type="gramEnd"/>
-      <w:r>
-        <w:rPr>
-          <w:rFonts w:ascii="Times New Roman" w:eastAsia="Times New Roman" w:hAnsi="Times New Roman" w:cs="Times New Roman"/>
-          <w:bCs/>
-          <w:kern w:val="0"/>
-          <w14:ligatures w14:val="none"/>
-        </w:rPr>
-        <w:t>20) NOT NULL</w:t>
+        <w:t>AUTHOR_NAME VARCHAR(20) NOT NULL</w:t>
       </w:r>
     </w:p>
     <w:p>
@@ -870,68 +819,37 @@
           <w:kern w:val="0"/>
           <w14:ligatures w14:val="none"/>
         </w:rPr>
-        <w:t xml:space="preserve">INSERT INTO BOOKS </w:t>
-      </w:r>
-      <w:proofErr w:type="gramStart"/>
-      <w:r>
-        <w:rPr>
-          <w:rFonts w:ascii="Times New Roman" w:eastAsia="Times New Roman" w:hAnsi="Times New Roman" w:cs="Times New Roman"/>
-          <w:bCs/>
-          <w:kern w:val="0"/>
-          <w14:ligatures w14:val="none"/>
-        </w:rPr>
-        <w:t>VALUES(</w:t>
-      </w:r>
-      <w:proofErr w:type="gramEnd"/>
-      <w:r>
-        <w:rPr>
-          <w:rFonts w:ascii="Times New Roman" w:eastAsia="Times New Roman" w:hAnsi="Times New Roman" w:cs="Times New Roman"/>
-          <w:bCs/>
-          <w:kern w:val="0"/>
-          <w14:ligatures w14:val="none"/>
-        </w:rPr>
-        <w:t>1, 'HARRY POTTER', 'DAVID')</w:t>
-      </w:r>
-    </w:p>
-    <w:p>
-      <w:pPr>
-        <w:rPr>
-          <w:rFonts w:ascii="Times New Roman" w:eastAsia="Times New Roman" w:hAnsi="Times New Roman" w:cs="Times New Roman"/>
-          <w:bCs/>
-          <w:kern w:val="0"/>
-          <w14:ligatures w14:val="none"/>
-        </w:rPr>
-      </w:pPr>
-    </w:p>
-    <w:p>
-      <w:pPr>
-        <w:rPr>
-          <w:rFonts w:ascii="Times New Roman" w:eastAsia="Times New Roman" w:hAnsi="Times New Roman" w:cs="Times New Roman"/>
-          <w:bCs/>
-          <w:kern w:val="0"/>
-          <w14:ligatures w14:val="none"/>
-        </w:rPr>
-      </w:pPr>
-      <w:r>
-        <w:rPr>
-          <w:rFonts w:ascii="Times New Roman" w:eastAsia="Times New Roman" w:hAnsi="Times New Roman" w:cs="Times New Roman"/>
-          <w:bCs/>
-          <w:kern w:val="0"/>
-          <w14:ligatures w14:val="none"/>
-        </w:rPr>
-        <w:t>CREATE TABLE LIBRARY_</w:t>
-      </w:r>
-      <w:proofErr w:type="gramStart"/>
-      <w:r>
-        <w:rPr>
-          <w:rFonts w:ascii="Times New Roman" w:eastAsia="Times New Roman" w:hAnsi="Times New Roman" w:cs="Times New Roman"/>
-          <w:bCs/>
-          <w:kern w:val="0"/>
-          <w14:ligatures w14:val="none"/>
-        </w:rPr>
-        <w:t>VISITORS(</w:t>
-      </w:r>
-      <w:proofErr w:type="gramEnd"/>
+        <w:t>INSERT INTO BOOKS VALUES(1, 'HARRY POTTER', 'DAVID')</w:t>
+      </w:r>
+    </w:p>
+    <w:p>
+      <w:pPr>
+        <w:rPr>
+          <w:rFonts w:ascii="Times New Roman" w:eastAsia="Times New Roman" w:hAnsi="Times New Roman" w:cs="Times New Roman"/>
+          <w:bCs/>
+          <w:kern w:val="0"/>
+          <w14:ligatures w14:val="none"/>
+        </w:rPr>
+      </w:pPr>
+    </w:p>
+    <w:p>
+      <w:pPr>
+        <w:rPr>
+          <w:rFonts w:ascii="Times New Roman" w:eastAsia="Times New Roman" w:hAnsi="Times New Roman" w:cs="Times New Roman"/>
+          <w:bCs/>
+          <w:kern w:val="0"/>
+          <w14:ligatures w14:val="none"/>
+        </w:rPr>
+      </w:pPr>
+      <w:r>
+        <w:rPr>
+          <w:rFonts w:ascii="Times New Roman" w:eastAsia="Times New Roman" w:hAnsi="Times New Roman" w:cs="Times New Roman"/>
+          <w:bCs/>
+          <w:kern w:val="0"/>
+          <w14:ligatures w14:val="none"/>
+        </w:rPr>
+        <w:t>CREATE TABLE LIBRARY_VISITORS(</w:t>
+      </w:r>
     </w:p>
     <w:p>
       <w:pPr>
@@ -970,27 +888,7 @@
           <w14:ligatures w14:val="none"/>
         </w:rPr>
         <w:tab/>
-        <w:t xml:space="preserve">NAME </w:t>
-      </w:r>
-      <w:proofErr w:type="gramStart"/>
-      <w:r>
-        <w:rPr>
-          <w:rFonts w:ascii="Times New Roman" w:eastAsia="Times New Roman" w:hAnsi="Times New Roman" w:cs="Times New Roman"/>
-          <w:bCs/>
-          <w:kern w:val="0"/>
-          <w14:ligatures w14:val="none"/>
-        </w:rPr>
-        <w:t>VARCHAR(</w:t>
-      </w:r>
-      <w:proofErr w:type="gramEnd"/>
-      <w:r>
-        <w:rPr>
-          <w:rFonts w:ascii="Times New Roman" w:eastAsia="Times New Roman" w:hAnsi="Times New Roman" w:cs="Times New Roman"/>
-          <w:bCs/>
-          <w:kern w:val="0"/>
-          <w14:ligatures w14:val="none"/>
-        </w:rPr>
-        <w:t>20) NOT NULL,</w:t>
+        <w:t>NAME VARCHAR(20) NOT NULL,</w:t>
       </w:r>
     </w:p>
     <w:p>
@@ -1030,27 +928,7 @@
           <w14:ligatures w14:val="none"/>
         </w:rPr>
         <w:tab/>
-        <w:t xml:space="preserve">EMAIL </w:t>
-      </w:r>
-      <w:proofErr w:type="gramStart"/>
-      <w:r>
-        <w:rPr>
-          <w:rFonts w:ascii="Times New Roman" w:eastAsia="Times New Roman" w:hAnsi="Times New Roman" w:cs="Times New Roman"/>
-          <w:bCs/>
-          <w:kern w:val="0"/>
-          <w14:ligatures w14:val="none"/>
-        </w:rPr>
-        <w:t>VARCHAR(</w:t>
-      </w:r>
-      <w:proofErr w:type="gramEnd"/>
-      <w:r>
-        <w:rPr>
-          <w:rFonts w:ascii="Times New Roman" w:eastAsia="Times New Roman" w:hAnsi="Times New Roman" w:cs="Times New Roman"/>
-          <w:bCs/>
-          <w:kern w:val="0"/>
-          <w14:ligatures w14:val="none"/>
-        </w:rPr>
-        <w:t>20) NOT NULL UNIQUE</w:t>
+        <w:t>EMAIL VARCHAR(20) NOT NULL UNIQUE</w:t>
       </w:r>
     </w:p>
     <w:p>
@@ -1128,167 +1006,85 @@
           <w:kern w:val="0"/>
           <w14:ligatures w14:val="none"/>
         </w:rPr>
-        <w:t>INSERT INTO LIBRARY_VISITORS(USER_</w:t>
-      </w:r>
-      <w:proofErr w:type="gramStart"/>
-      <w:r>
-        <w:rPr>
-          <w:rFonts w:ascii="Times New Roman" w:eastAsia="Times New Roman" w:hAnsi="Times New Roman" w:cs="Times New Roman"/>
-          <w:bCs/>
-          <w:kern w:val="0"/>
-          <w14:ligatures w14:val="none"/>
-        </w:rPr>
-        <w:t>ID,NAME</w:t>
-      </w:r>
-      <w:proofErr w:type="gramEnd"/>
-      <w:r>
-        <w:rPr>
-          <w:rFonts w:ascii="Times New Roman" w:eastAsia="Times New Roman" w:hAnsi="Times New Roman" w:cs="Times New Roman"/>
-          <w:bCs/>
-          <w:kern w:val="0"/>
-          <w14:ligatures w14:val="none"/>
-        </w:rPr>
-        <w:t>,</w:t>
-      </w:r>
-      <w:proofErr w:type="gramStart"/>
-      <w:r>
-        <w:rPr>
-          <w:rFonts w:ascii="Times New Roman" w:eastAsia="Times New Roman" w:hAnsi="Times New Roman" w:cs="Times New Roman"/>
-          <w:bCs/>
-          <w:kern w:val="0"/>
-          <w14:ligatures w14:val="none"/>
-        </w:rPr>
-        <w:t>AGE,EMAIL</w:t>
-      </w:r>
-      <w:proofErr w:type="gramEnd"/>
-      <w:r>
-        <w:rPr>
-          <w:rFonts w:ascii="Times New Roman" w:eastAsia="Times New Roman" w:hAnsi="Times New Roman" w:cs="Times New Roman"/>
-          <w:bCs/>
-          <w:kern w:val="0"/>
-          <w14:ligatures w14:val="none"/>
-        </w:rPr>
-        <w:t>)</w:t>
-      </w:r>
-    </w:p>
-    <w:p>
-      <w:pPr>
-        <w:rPr>
-          <w:rFonts w:ascii="Times New Roman" w:eastAsia="Times New Roman" w:hAnsi="Times New Roman" w:cs="Times New Roman"/>
-          <w:bCs/>
-          <w:kern w:val="0"/>
-          <w14:ligatures w14:val="none"/>
-        </w:rPr>
-      </w:pPr>
-      <w:proofErr w:type="gramStart"/>
-      <w:r>
-        <w:rPr>
-          <w:rFonts w:ascii="Times New Roman" w:eastAsia="Times New Roman" w:hAnsi="Times New Roman" w:cs="Times New Roman"/>
-          <w:bCs/>
-          <w:kern w:val="0"/>
-          <w14:ligatures w14:val="none"/>
-        </w:rPr>
-        <w:t>VALUES(</w:t>
-      </w:r>
-      <w:proofErr w:type="gramEnd"/>
-      <w:r>
-        <w:rPr>
-          <w:rFonts w:ascii="Times New Roman" w:eastAsia="Times New Roman" w:hAnsi="Times New Roman" w:cs="Times New Roman"/>
-          <w:bCs/>
-          <w:kern w:val="0"/>
-          <w14:ligatures w14:val="none"/>
-        </w:rPr>
-        <w:t>501, 'Ansh Sharma', 20, 'ansh21@gmail.com')</w:t>
-      </w:r>
-    </w:p>
-    <w:p>
-      <w:pPr>
-        <w:rPr>
-          <w:rFonts w:ascii="Times New Roman" w:eastAsia="Times New Roman" w:hAnsi="Times New Roman" w:cs="Times New Roman"/>
-          <w:bCs/>
-          <w:kern w:val="0"/>
-          <w14:ligatures w14:val="none"/>
-        </w:rPr>
-      </w:pPr>
-    </w:p>
-    <w:p>
-      <w:pPr>
-        <w:rPr>
-          <w:rFonts w:ascii="Times New Roman" w:eastAsia="Times New Roman" w:hAnsi="Times New Roman" w:cs="Times New Roman"/>
-          <w:bCs/>
-          <w:kern w:val="0"/>
-          <w14:ligatures w14:val="none"/>
-        </w:rPr>
-      </w:pPr>
-      <w:r>
-        <w:rPr>
-          <w:rFonts w:ascii="Times New Roman" w:eastAsia="Times New Roman" w:hAnsi="Times New Roman" w:cs="Times New Roman"/>
-          <w:bCs/>
-          <w:kern w:val="0"/>
-          <w14:ligatures w14:val="none"/>
-        </w:rPr>
-        <w:t xml:space="preserve">INSERT INTO LIBRARY_VISITORS </w:t>
-      </w:r>
-      <w:proofErr w:type="gramStart"/>
-      <w:r>
-        <w:rPr>
-          <w:rFonts w:ascii="Times New Roman" w:eastAsia="Times New Roman" w:hAnsi="Times New Roman" w:cs="Times New Roman"/>
-          <w:bCs/>
-          <w:kern w:val="0"/>
-          <w14:ligatures w14:val="none"/>
-        </w:rPr>
-        <w:t>VALUES(</w:t>
-      </w:r>
-      <w:proofErr w:type="gramEnd"/>
-      <w:r>
-        <w:rPr>
-          <w:rFonts w:ascii="Times New Roman" w:eastAsia="Times New Roman" w:hAnsi="Times New Roman" w:cs="Times New Roman"/>
-          <w:bCs/>
-          <w:kern w:val="0"/>
-          <w14:ligatures w14:val="none"/>
-        </w:rPr>
-        <w:t>502, 'Nitin', 19, 'nitin2@gmail.com')</w:t>
-      </w:r>
-    </w:p>
-    <w:p>
-      <w:pPr>
-        <w:rPr>
-          <w:rFonts w:ascii="Times New Roman" w:eastAsia="Times New Roman" w:hAnsi="Times New Roman" w:cs="Times New Roman"/>
-          <w:bCs/>
-          <w:kern w:val="0"/>
-          <w14:ligatures w14:val="none"/>
-        </w:rPr>
-      </w:pPr>
-    </w:p>
-    <w:p>
-      <w:pPr>
-        <w:rPr>
-          <w:rFonts w:ascii="Times New Roman" w:eastAsia="Times New Roman" w:hAnsi="Times New Roman" w:cs="Times New Roman"/>
-          <w:bCs/>
-          <w:kern w:val="0"/>
-          <w14:ligatures w14:val="none"/>
-        </w:rPr>
-      </w:pPr>
-      <w:r>
-        <w:rPr>
-          <w:rFonts w:ascii="Times New Roman" w:eastAsia="Times New Roman" w:hAnsi="Times New Roman" w:cs="Times New Roman"/>
-          <w:bCs/>
-          <w:kern w:val="0"/>
-          <w14:ligatures w14:val="none"/>
-        </w:rPr>
-        <w:t>CREATE TABLE BOOK_</w:t>
-      </w:r>
-      <w:proofErr w:type="gramStart"/>
-      <w:r>
-        <w:rPr>
-          <w:rFonts w:ascii="Times New Roman" w:eastAsia="Times New Roman" w:hAnsi="Times New Roman" w:cs="Times New Roman"/>
-          <w:bCs/>
-          <w:kern w:val="0"/>
-          <w14:ligatures w14:val="none"/>
-        </w:rPr>
-        <w:t>ISSUE(</w:t>
-      </w:r>
-      <w:proofErr w:type="gramEnd"/>
+        <w:t>INSERT INTO LIBRARY_VISITORS(USER_ID,NAME,AGE,EMAIL)</w:t>
+      </w:r>
+    </w:p>
+    <w:p>
+      <w:pPr>
+        <w:rPr>
+          <w:rFonts w:ascii="Times New Roman" w:eastAsia="Times New Roman" w:hAnsi="Times New Roman" w:cs="Times New Roman"/>
+          <w:bCs/>
+          <w:kern w:val="0"/>
+          <w14:ligatures w14:val="none"/>
+        </w:rPr>
+      </w:pPr>
+      <w:r>
+        <w:rPr>
+          <w:rFonts w:ascii="Times New Roman" w:eastAsia="Times New Roman" w:hAnsi="Times New Roman" w:cs="Times New Roman"/>
+          <w:bCs/>
+          <w:kern w:val="0"/>
+          <w14:ligatures w14:val="none"/>
+        </w:rPr>
+        <w:t>VALUES(501, 'Ansh Sharma', 20, 'ansh21@gmail.com')</w:t>
+      </w:r>
+    </w:p>
+    <w:p>
+      <w:pPr>
+        <w:rPr>
+          <w:rFonts w:ascii="Times New Roman" w:eastAsia="Times New Roman" w:hAnsi="Times New Roman" w:cs="Times New Roman"/>
+          <w:bCs/>
+          <w:kern w:val="0"/>
+          <w14:ligatures w14:val="none"/>
+        </w:rPr>
+      </w:pPr>
+    </w:p>
+    <w:p>
+      <w:pPr>
+        <w:rPr>
+          <w:rFonts w:ascii="Times New Roman" w:eastAsia="Times New Roman" w:hAnsi="Times New Roman" w:cs="Times New Roman"/>
+          <w:bCs/>
+          <w:kern w:val="0"/>
+          <w14:ligatures w14:val="none"/>
+        </w:rPr>
+      </w:pPr>
+      <w:r>
+        <w:rPr>
+          <w:rFonts w:ascii="Times New Roman" w:eastAsia="Times New Roman" w:hAnsi="Times New Roman" w:cs="Times New Roman"/>
+          <w:bCs/>
+          <w:kern w:val="0"/>
+          <w14:ligatures w14:val="none"/>
+        </w:rPr>
+        <w:t>INSERT INTO LIBRARY_VISITORS VALUES(502, 'Nitin', 19, 'nitin2@gmail.com')</w:t>
+      </w:r>
+    </w:p>
+    <w:p>
+      <w:pPr>
+        <w:rPr>
+          <w:rFonts w:ascii="Times New Roman" w:eastAsia="Times New Roman" w:hAnsi="Times New Roman" w:cs="Times New Roman"/>
+          <w:bCs/>
+          <w:kern w:val="0"/>
+          <w14:ligatures w14:val="none"/>
+        </w:rPr>
+      </w:pPr>
+    </w:p>
+    <w:p>
+      <w:pPr>
+        <w:rPr>
+          <w:rFonts w:ascii="Times New Roman" w:eastAsia="Times New Roman" w:hAnsi="Times New Roman" w:cs="Times New Roman"/>
+          <w:bCs/>
+          <w:kern w:val="0"/>
+          <w14:ligatures w14:val="none"/>
+        </w:rPr>
+      </w:pPr>
+      <w:r>
+        <w:rPr>
+          <w:rFonts w:ascii="Times New Roman" w:eastAsia="Times New Roman" w:hAnsi="Times New Roman" w:cs="Times New Roman"/>
+          <w:bCs/>
+          <w:kern w:val="0"/>
+          <w14:ligatures w14:val="none"/>
+        </w:rPr>
+        <w:t>CREATE TABLE BOOK_ISSUE(</w:t>
+      </w:r>
     </w:p>
     <w:p>
       <w:pPr>
@@ -1444,27 +1240,7 @@
           <w:kern w:val="0"/>
           <w14:ligatures w14:val="none"/>
         </w:rPr>
-        <w:t xml:space="preserve">INSERT INTO BOOK_ISSUE </w:t>
-      </w:r>
-      <w:proofErr w:type="gramStart"/>
-      <w:r>
-        <w:rPr>
-          <w:rFonts w:ascii="Times New Roman" w:eastAsia="Times New Roman" w:hAnsi="Times New Roman" w:cs="Times New Roman"/>
-          <w:bCs/>
-          <w:kern w:val="0"/>
-          <w14:ligatures w14:val="none"/>
-        </w:rPr>
-        <w:t>VALUES(</w:t>
-      </w:r>
-      <w:proofErr w:type="gramEnd"/>
-      <w:r>
-        <w:rPr>
-          <w:rFonts w:ascii="Times New Roman" w:eastAsia="Times New Roman" w:hAnsi="Times New Roman" w:cs="Times New Roman"/>
-          <w:bCs/>
-          <w:kern w:val="0"/>
-          <w14:ligatures w14:val="none"/>
-        </w:rPr>
-        <w:t>101, 501, 1)</w:t>
+        <w:t>INSERT INTO BOOK_ISSUE VALUES(101, 501, 1)</w:t>
       </w:r>
     </w:p>
     <w:p>
@@ -1570,106 +1346,26 @@
           <w:kern w:val="0"/>
           <w14:ligatures w14:val="none"/>
         </w:rPr>
-        <w:t xml:space="preserve">GRANT </w:t>
-      </w:r>
-      <w:proofErr w:type="gramStart"/>
-      <w:r>
-        <w:rPr>
-          <w:rFonts w:ascii="Times New Roman" w:eastAsia="Times New Roman" w:hAnsi="Times New Roman" w:cs="Times New Roman"/>
-          <w:bCs/>
-          <w:kern w:val="0"/>
-          <w14:ligatures w14:val="none"/>
-        </w:rPr>
-        <w:t>SELECT,INSERT</w:t>
-      </w:r>
-      <w:proofErr w:type="gramEnd"/>
-      <w:r>
-        <w:rPr>
-          <w:rFonts w:ascii="Times New Roman" w:eastAsia="Times New Roman" w:hAnsi="Times New Roman" w:cs="Times New Roman"/>
-          <w:bCs/>
-          <w:kern w:val="0"/>
-          <w14:ligatures w14:val="none"/>
-        </w:rPr>
-        <w:t>,</w:t>
-      </w:r>
-      <w:proofErr w:type="gramStart"/>
-      <w:r>
-        <w:rPr>
-          <w:rFonts w:ascii="Times New Roman" w:eastAsia="Times New Roman" w:hAnsi="Times New Roman" w:cs="Times New Roman"/>
-          <w:bCs/>
-          <w:kern w:val="0"/>
-          <w14:ligatures w14:val="none"/>
-        </w:rPr>
-        <w:t>DELETE,UPDATE</w:t>
-      </w:r>
-      <w:proofErr w:type="gramEnd"/>
-      <w:r>
-        <w:rPr>
-          <w:rFonts w:ascii="Times New Roman" w:eastAsia="Times New Roman" w:hAnsi="Times New Roman" w:cs="Times New Roman"/>
-          <w:bCs/>
-          <w:kern w:val="0"/>
-          <w14:ligatures w14:val="none"/>
-        </w:rPr>
-        <w:t xml:space="preserve"> ON BOOKS TO LIBRARIAN</w:t>
-      </w:r>
-    </w:p>
-    <w:p>
-      <w:pPr>
-        <w:rPr>
-          <w:rFonts w:ascii="Times New Roman" w:eastAsia="Times New Roman" w:hAnsi="Times New Roman" w:cs="Times New Roman"/>
-          <w:bCs/>
-          <w:kern w:val="0"/>
-          <w14:ligatures w14:val="none"/>
-        </w:rPr>
-      </w:pPr>
-      <w:r>
-        <w:rPr>
-          <w:rFonts w:ascii="Times New Roman" w:eastAsia="Times New Roman" w:hAnsi="Times New Roman" w:cs="Times New Roman"/>
-          <w:bCs/>
-          <w:kern w:val="0"/>
-          <w14:ligatures w14:val="none"/>
-        </w:rPr>
-        <w:t xml:space="preserve">REVOKE </w:t>
-      </w:r>
-      <w:proofErr w:type="gramStart"/>
-      <w:r>
-        <w:rPr>
-          <w:rFonts w:ascii="Times New Roman" w:eastAsia="Times New Roman" w:hAnsi="Times New Roman" w:cs="Times New Roman"/>
-          <w:bCs/>
-          <w:kern w:val="0"/>
-          <w14:ligatures w14:val="none"/>
-        </w:rPr>
-        <w:t>SELECT,INSERT</w:t>
-      </w:r>
-      <w:proofErr w:type="gramEnd"/>
-      <w:r>
-        <w:rPr>
-          <w:rFonts w:ascii="Times New Roman" w:eastAsia="Times New Roman" w:hAnsi="Times New Roman" w:cs="Times New Roman"/>
-          <w:bCs/>
-          <w:kern w:val="0"/>
-          <w14:ligatures w14:val="none"/>
-        </w:rPr>
-        <w:t>,</w:t>
-      </w:r>
-      <w:proofErr w:type="gramStart"/>
-      <w:r>
-        <w:rPr>
-          <w:rFonts w:ascii="Times New Roman" w:eastAsia="Times New Roman" w:hAnsi="Times New Roman" w:cs="Times New Roman"/>
-          <w:bCs/>
-          <w:kern w:val="0"/>
-          <w14:ligatures w14:val="none"/>
-        </w:rPr>
-        <w:t>DELETE,UPDATE</w:t>
-      </w:r>
-      <w:proofErr w:type="gramEnd"/>
-      <w:r>
-        <w:rPr>
-          <w:rFonts w:ascii="Times New Roman" w:eastAsia="Times New Roman" w:hAnsi="Times New Roman" w:cs="Times New Roman"/>
-          <w:bCs/>
-          <w:kern w:val="0"/>
-          <w14:ligatures w14:val="none"/>
-        </w:rPr>
-        <w:t xml:space="preserve"> ON BOOKS FROM LIBRARIAN</w:t>
+        <w:t>GRANT SELECT,INSERT,DELETE,UPDATE ON BOOKS TO LIBRARIAN</w:t>
+      </w:r>
+    </w:p>
+    <w:p>
+      <w:pPr>
+        <w:rPr>
+          <w:rFonts w:ascii="Times New Roman" w:eastAsia="Times New Roman" w:hAnsi="Times New Roman" w:cs="Times New Roman"/>
+          <w:bCs/>
+          <w:kern w:val="0"/>
+          <w14:ligatures w14:val="none"/>
+        </w:rPr>
+      </w:pPr>
+      <w:r>
+        <w:rPr>
+          <w:rFonts w:ascii="Times New Roman" w:eastAsia="Times New Roman" w:hAnsi="Times New Roman" w:cs="Times New Roman"/>
+          <w:bCs/>
+          <w:kern w:val="0"/>
+          <w14:ligatures w14:val="none"/>
+        </w:rPr>
+        <w:t>REVOKE SELECT,INSERT,DELETE,UPDATE ON BOOKS FROM LIBRARIAN</w:t>
       </w:r>
     </w:p>
     <w:p>
@@ -1753,6 +1449,7 @@
         <w:rPr>
           <w:rFonts w:ascii="Times New Roman" w:eastAsia="Times New Roman" w:hAnsi="Times New Roman" w:cs="Times New Roman"/>
           <w:bCs/>
+          <w:noProof/>
           <w:kern w:val="0"/>
           <w14:ligatures w14:val="none"/>
         </w:rPr>
@@ -1846,6 +1543,7 @@
         <w:rPr>
           <w:rFonts w:ascii="Times New Roman" w:eastAsia="Times New Roman" w:hAnsi="Times New Roman" w:cs="Times New Roman"/>
           <w:bCs/>
+          <w:noProof/>
           <w:kern w:val="0"/>
           <w14:ligatures w14:val="none"/>
         </w:rPr>
@@ -1909,6 +1607,7 @@
         <w:rPr>
           <w:rFonts w:ascii="Times New Roman" w:eastAsia="Times New Roman" w:hAnsi="Times New Roman" w:cs="Times New Roman"/>
           <w:bCs/>
+          <w:noProof/>
           <w:kern w:val="0"/>
           <w14:ligatures w14:val="none"/>
         </w:rPr>
@@ -4194,6 +3893,7 @@
   <w:style w:type="character" w:default="1" w:styleId="DefaultParagraphFont">
     <w:name w:val="Default Paragraph Font"/>
     <w:uiPriority w:val="1"/>
+    <w:semiHidden/>
     <w:unhideWhenUsed/>
   </w:style>
   <w:style w:type="table" w:default="1" w:styleId="TableNormal">

</xml_diff>

<commit_message>
Update experiment docs, images, and readme for clarity
Revised Experiment_1 and Experiment_2 documentation and added corresponding PDF exports. Updated and added images for Experiment_2. Overhauled Experiment_2/readme.md for improved structure, clarity, and step-by-step instructions on SQL SELECT queries with WHERE, GROUP BY, HAVING, and ORDER BY clauses.
</commit_message>
<xml_diff>
--- a/Experiment_1/Experiment_1.docx
+++ b/Experiment_1/Experiment_1.docx
@@ -390,7 +390,7 @@
           <w:kern w:val="0"/>
           <w14:ligatures w14:val="none"/>
         </w:rPr>
-        <w:t>Practical/Experiment Steps</w:t>
+        <w:t>Procedure</w:t>
       </w:r>
     </w:p>
     <w:p>
@@ -653,8 +653,19 @@
           <w:kern w:val="0"/>
           <w14:ligatures w14:val="none"/>
         </w:rPr>
-        <w:t>CREATE TABLE BOOKS(</w:t>
-      </w:r>
+        <w:t xml:space="preserve">CREATE TABLE </w:t>
+      </w:r>
+      <w:proofErr w:type="gramStart"/>
+      <w:r>
+        <w:rPr>
+          <w:rFonts w:ascii="Times New Roman" w:eastAsia="Times New Roman" w:hAnsi="Times New Roman" w:cs="Times New Roman"/>
+          <w:bCs/>
+          <w:kern w:val="0"/>
+          <w14:ligatures w14:val="none"/>
+        </w:rPr>
+        <w:t>BOOKS(</w:t>
+      </w:r>
+      <w:proofErr w:type="gramEnd"/>
     </w:p>
     <w:p>
       <w:pPr>
@@ -693,7 +704,27 @@
           <w14:ligatures w14:val="none"/>
         </w:rPr>
         <w:tab/>
-        <w:t>BOOK_NAME VARCHAR(20) NOT NULL,</w:t>
+        <w:t xml:space="preserve">BOOK_NAME </w:t>
+      </w:r>
+      <w:proofErr w:type="gramStart"/>
+      <w:r>
+        <w:rPr>
+          <w:rFonts w:ascii="Times New Roman" w:eastAsia="Times New Roman" w:hAnsi="Times New Roman" w:cs="Times New Roman"/>
+          <w:bCs/>
+          <w:kern w:val="0"/>
+          <w14:ligatures w14:val="none"/>
+        </w:rPr>
+        <w:t>VARCHAR(</w:t>
+      </w:r>
+      <w:proofErr w:type="gramEnd"/>
+      <w:r>
+        <w:rPr>
+          <w:rFonts w:ascii="Times New Roman" w:eastAsia="Times New Roman" w:hAnsi="Times New Roman" w:cs="Times New Roman"/>
+          <w:bCs/>
+          <w:kern w:val="0"/>
+          <w14:ligatures w14:val="none"/>
+        </w:rPr>
+        <w:t>20) NOT NULL,</w:t>
       </w:r>
     </w:p>
     <w:p>
@@ -713,7 +744,27 @@
           <w14:ligatures w14:val="none"/>
         </w:rPr>
         <w:tab/>
-        <w:t>AUTHOR_NAME VARCHAR(20) NOT NULL</w:t>
+        <w:t xml:space="preserve">AUTHOR_NAME </w:t>
+      </w:r>
+      <w:proofErr w:type="gramStart"/>
+      <w:r>
+        <w:rPr>
+          <w:rFonts w:ascii="Times New Roman" w:eastAsia="Times New Roman" w:hAnsi="Times New Roman" w:cs="Times New Roman"/>
+          <w:bCs/>
+          <w:kern w:val="0"/>
+          <w14:ligatures w14:val="none"/>
+        </w:rPr>
+        <w:t>VARCHAR(</w:t>
+      </w:r>
+      <w:proofErr w:type="gramEnd"/>
+      <w:r>
+        <w:rPr>
+          <w:rFonts w:ascii="Times New Roman" w:eastAsia="Times New Roman" w:hAnsi="Times New Roman" w:cs="Times New Roman"/>
+          <w:bCs/>
+          <w:kern w:val="0"/>
+          <w14:ligatures w14:val="none"/>
+        </w:rPr>
+        <w:t>20) NOT NULL</w:t>
       </w:r>
     </w:p>
     <w:p>
@@ -819,37 +870,68 @@
           <w:kern w:val="0"/>
           <w14:ligatures w14:val="none"/>
         </w:rPr>
-        <w:t>INSERT INTO BOOKS VALUES(1, 'HARRY POTTER', 'DAVID')</w:t>
-      </w:r>
-    </w:p>
-    <w:p>
-      <w:pPr>
-        <w:rPr>
-          <w:rFonts w:ascii="Times New Roman" w:eastAsia="Times New Roman" w:hAnsi="Times New Roman" w:cs="Times New Roman"/>
-          <w:bCs/>
-          <w:kern w:val="0"/>
-          <w14:ligatures w14:val="none"/>
-        </w:rPr>
-      </w:pPr>
-    </w:p>
-    <w:p>
-      <w:pPr>
-        <w:rPr>
-          <w:rFonts w:ascii="Times New Roman" w:eastAsia="Times New Roman" w:hAnsi="Times New Roman" w:cs="Times New Roman"/>
-          <w:bCs/>
-          <w:kern w:val="0"/>
-          <w14:ligatures w14:val="none"/>
-        </w:rPr>
-      </w:pPr>
-      <w:r>
-        <w:rPr>
-          <w:rFonts w:ascii="Times New Roman" w:eastAsia="Times New Roman" w:hAnsi="Times New Roman" w:cs="Times New Roman"/>
-          <w:bCs/>
-          <w:kern w:val="0"/>
-          <w14:ligatures w14:val="none"/>
-        </w:rPr>
-        <w:t>CREATE TABLE LIBRARY_VISITORS(</w:t>
-      </w:r>
+        <w:t xml:space="preserve">INSERT INTO BOOKS </w:t>
+      </w:r>
+      <w:proofErr w:type="gramStart"/>
+      <w:r>
+        <w:rPr>
+          <w:rFonts w:ascii="Times New Roman" w:eastAsia="Times New Roman" w:hAnsi="Times New Roman" w:cs="Times New Roman"/>
+          <w:bCs/>
+          <w:kern w:val="0"/>
+          <w14:ligatures w14:val="none"/>
+        </w:rPr>
+        <w:t>VALUES(</w:t>
+      </w:r>
+      <w:proofErr w:type="gramEnd"/>
+      <w:r>
+        <w:rPr>
+          <w:rFonts w:ascii="Times New Roman" w:eastAsia="Times New Roman" w:hAnsi="Times New Roman" w:cs="Times New Roman"/>
+          <w:bCs/>
+          <w:kern w:val="0"/>
+          <w14:ligatures w14:val="none"/>
+        </w:rPr>
+        <w:t>1, 'HARRY POTTER', 'DAVID')</w:t>
+      </w:r>
+    </w:p>
+    <w:p>
+      <w:pPr>
+        <w:rPr>
+          <w:rFonts w:ascii="Times New Roman" w:eastAsia="Times New Roman" w:hAnsi="Times New Roman" w:cs="Times New Roman"/>
+          <w:bCs/>
+          <w:kern w:val="0"/>
+          <w14:ligatures w14:val="none"/>
+        </w:rPr>
+      </w:pPr>
+    </w:p>
+    <w:p>
+      <w:pPr>
+        <w:rPr>
+          <w:rFonts w:ascii="Times New Roman" w:eastAsia="Times New Roman" w:hAnsi="Times New Roman" w:cs="Times New Roman"/>
+          <w:bCs/>
+          <w:kern w:val="0"/>
+          <w14:ligatures w14:val="none"/>
+        </w:rPr>
+      </w:pPr>
+      <w:r>
+        <w:rPr>
+          <w:rFonts w:ascii="Times New Roman" w:eastAsia="Times New Roman" w:hAnsi="Times New Roman" w:cs="Times New Roman"/>
+          <w:bCs/>
+          <w:kern w:val="0"/>
+          <w14:ligatures w14:val="none"/>
+        </w:rPr>
+        <w:t>CREATE TABLE LIBRARY_</w:t>
+      </w:r>
+      <w:proofErr w:type="gramStart"/>
+      <w:r>
+        <w:rPr>
+          <w:rFonts w:ascii="Times New Roman" w:eastAsia="Times New Roman" w:hAnsi="Times New Roman" w:cs="Times New Roman"/>
+          <w:bCs/>
+          <w:kern w:val="0"/>
+          <w14:ligatures w14:val="none"/>
+        </w:rPr>
+        <w:t>VISITORS(</w:t>
+      </w:r>
+      <w:proofErr w:type="gramEnd"/>
     </w:p>
     <w:p>
       <w:pPr>
@@ -888,7 +970,27 @@
           <w14:ligatures w14:val="none"/>
         </w:rPr>
         <w:tab/>
-        <w:t>NAME VARCHAR(20) NOT NULL,</w:t>
+        <w:t xml:space="preserve">NAME </w:t>
+      </w:r>
+      <w:proofErr w:type="gramStart"/>
+      <w:r>
+        <w:rPr>
+          <w:rFonts w:ascii="Times New Roman" w:eastAsia="Times New Roman" w:hAnsi="Times New Roman" w:cs="Times New Roman"/>
+          <w:bCs/>
+          <w:kern w:val="0"/>
+          <w14:ligatures w14:val="none"/>
+        </w:rPr>
+        <w:t>VARCHAR(</w:t>
+      </w:r>
+      <w:proofErr w:type="gramEnd"/>
+      <w:r>
+        <w:rPr>
+          <w:rFonts w:ascii="Times New Roman" w:eastAsia="Times New Roman" w:hAnsi="Times New Roman" w:cs="Times New Roman"/>
+          <w:bCs/>
+          <w:kern w:val="0"/>
+          <w14:ligatures w14:val="none"/>
+        </w:rPr>
+        <w:t>20) NOT NULL,</w:t>
       </w:r>
     </w:p>
     <w:p>
@@ -928,7 +1030,27 @@
           <w14:ligatures w14:val="none"/>
         </w:rPr>
         <w:tab/>
-        <w:t>EMAIL VARCHAR(20) NOT NULL UNIQUE</w:t>
+        <w:t xml:space="preserve">EMAIL </w:t>
+      </w:r>
+      <w:proofErr w:type="gramStart"/>
+      <w:r>
+        <w:rPr>
+          <w:rFonts w:ascii="Times New Roman" w:eastAsia="Times New Roman" w:hAnsi="Times New Roman" w:cs="Times New Roman"/>
+          <w:bCs/>
+          <w:kern w:val="0"/>
+          <w14:ligatures w14:val="none"/>
+        </w:rPr>
+        <w:t>VARCHAR(</w:t>
+      </w:r>
+      <w:proofErr w:type="gramEnd"/>
+      <w:r>
+        <w:rPr>
+          <w:rFonts w:ascii="Times New Roman" w:eastAsia="Times New Roman" w:hAnsi="Times New Roman" w:cs="Times New Roman"/>
+          <w:bCs/>
+          <w:kern w:val="0"/>
+          <w14:ligatures w14:val="none"/>
+        </w:rPr>
+        <w:t>20) NOT NULL UNIQUE</w:t>
       </w:r>
     </w:p>
     <w:p>
@@ -1006,85 +1128,167 @@
           <w:kern w:val="0"/>
           <w14:ligatures w14:val="none"/>
         </w:rPr>
-        <w:t>INSERT INTO LIBRARY_VISITORS(USER_ID,NAME,AGE,EMAIL)</w:t>
-      </w:r>
-    </w:p>
-    <w:p>
-      <w:pPr>
-        <w:rPr>
-          <w:rFonts w:ascii="Times New Roman" w:eastAsia="Times New Roman" w:hAnsi="Times New Roman" w:cs="Times New Roman"/>
-          <w:bCs/>
-          <w:kern w:val="0"/>
-          <w14:ligatures w14:val="none"/>
-        </w:rPr>
-      </w:pPr>
-      <w:r>
-        <w:rPr>
-          <w:rFonts w:ascii="Times New Roman" w:eastAsia="Times New Roman" w:hAnsi="Times New Roman" w:cs="Times New Roman"/>
-          <w:bCs/>
-          <w:kern w:val="0"/>
-          <w14:ligatures w14:val="none"/>
-        </w:rPr>
-        <w:t>VALUES(501, 'Ansh Sharma', 20, 'ansh21@gmail.com')</w:t>
-      </w:r>
-    </w:p>
-    <w:p>
-      <w:pPr>
-        <w:rPr>
-          <w:rFonts w:ascii="Times New Roman" w:eastAsia="Times New Roman" w:hAnsi="Times New Roman" w:cs="Times New Roman"/>
-          <w:bCs/>
-          <w:kern w:val="0"/>
-          <w14:ligatures w14:val="none"/>
-        </w:rPr>
-      </w:pPr>
-    </w:p>
-    <w:p>
-      <w:pPr>
-        <w:rPr>
-          <w:rFonts w:ascii="Times New Roman" w:eastAsia="Times New Roman" w:hAnsi="Times New Roman" w:cs="Times New Roman"/>
-          <w:bCs/>
-          <w:kern w:val="0"/>
-          <w14:ligatures w14:val="none"/>
-        </w:rPr>
-      </w:pPr>
-      <w:r>
-        <w:rPr>
-          <w:rFonts w:ascii="Times New Roman" w:eastAsia="Times New Roman" w:hAnsi="Times New Roman" w:cs="Times New Roman"/>
-          <w:bCs/>
-          <w:kern w:val="0"/>
-          <w14:ligatures w14:val="none"/>
-        </w:rPr>
-        <w:t>INSERT INTO LIBRARY_VISITORS VALUES(502, 'Nitin', 19, 'nitin2@gmail.com')</w:t>
-      </w:r>
-    </w:p>
-    <w:p>
-      <w:pPr>
-        <w:rPr>
-          <w:rFonts w:ascii="Times New Roman" w:eastAsia="Times New Roman" w:hAnsi="Times New Roman" w:cs="Times New Roman"/>
-          <w:bCs/>
-          <w:kern w:val="0"/>
-          <w14:ligatures w14:val="none"/>
-        </w:rPr>
-      </w:pPr>
-    </w:p>
-    <w:p>
-      <w:pPr>
-        <w:rPr>
-          <w:rFonts w:ascii="Times New Roman" w:eastAsia="Times New Roman" w:hAnsi="Times New Roman" w:cs="Times New Roman"/>
-          <w:bCs/>
-          <w:kern w:val="0"/>
-          <w14:ligatures w14:val="none"/>
-        </w:rPr>
-      </w:pPr>
-      <w:r>
-        <w:rPr>
-          <w:rFonts w:ascii="Times New Roman" w:eastAsia="Times New Roman" w:hAnsi="Times New Roman" w:cs="Times New Roman"/>
-          <w:bCs/>
-          <w:kern w:val="0"/>
-          <w14:ligatures w14:val="none"/>
-        </w:rPr>
-        <w:t>CREATE TABLE BOOK_ISSUE(</w:t>
-      </w:r>
+        <w:t>INSERT INTO LIBRARY_VISITORS(USER_</w:t>
+      </w:r>
+      <w:proofErr w:type="gramStart"/>
+      <w:r>
+        <w:rPr>
+          <w:rFonts w:ascii="Times New Roman" w:eastAsia="Times New Roman" w:hAnsi="Times New Roman" w:cs="Times New Roman"/>
+          <w:bCs/>
+          <w:kern w:val="0"/>
+          <w14:ligatures w14:val="none"/>
+        </w:rPr>
+        <w:t>ID,NAME</w:t>
+      </w:r>
+      <w:proofErr w:type="gramEnd"/>
+      <w:r>
+        <w:rPr>
+          <w:rFonts w:ascii="Times New Roman" w:eastAsia="Times New Roman" w:hAnsi="Times New Roman" w:cs="Times New Roman"/>
+          <w:bCs/>
+          <w:kern w:val="0"/>
+          <w14:ligatures w14:val="none"/>
+        </w:rPr>
+        <w:t>,</w:t>
+      </w:r>
+      <w:proofErr w:type="gramStart"/>
+      <w:r>
+        <w:rPr>
+          <w:rFonts w:ascii="Times New Roman" w:eastAsia="Times New Roman" w:hAnsi="Times New Roman" w:cs="Times New Roman"/>
+          <w:bCs/>
+          <w:kern w:val="0"/>
+          <w14:ligatures w14:val="none"/>
+        </w:rPr>
+        <w:t>AGE,EMAIL</w:t>
+      </w:r>
+      <w:proofErr w:type="gramEnd"/>
+      <w:r>
+        <w:rPr>
+          <w:rFonts w:ascii="Times New Roman" w:eastAsia="Times New Roman" w:hAnsi="Times New Roman" w:cs="Times New Roman"/>
+          <w:bCs/>
+          <w:kern w:val="0"/>
+          <w14:ligatures w14:val="none"/>
+        </w:rPr>
+        <w:t>)</w:t>
+      </w:r>
+    </w:p>
+    <w:p>
+      <w:pPr>
+        <w:rPr>
+          <w:rFonts w:ascii="Times New Roman" w:eastAsia="Times New Roman" w:hAnsi="Times New Roman" w:cs="Times New Roman"/>
+          <w:bCs/>
+          <w:kern w:val="0"/>
+          <w14:ligatures w14:val="none"/>
+        </w:rPr>
+      </w:pPr>
+      <w:proofErr w:type="gramStart"/>
+      <w:r>
+        <w:rPr>
+          <w:rFonts w:ascii="Times New Roman" w:eastAsia="Times New Roman" w:hAnsi="Times New Roman" w:cs="Times New Roman"/>
+          <w:bCs/>
+          <w:kern w:val="0"/>
+          <w14:ligatures w14:val="none"/>
+        </w:rPr>
+        <w:t>VALUES(</w:t>
+      </w:r>
+      <w:proofErr w:type="gramEnd"/>
+      <w:r>
+        <w:rPr>
+          <w:rFonts w:ascii="Times New Roman" w:eastAsia="Times New Roman" w:hAnsi="Times New Roman" w:cs="Times New Roman"/>
+          <w:bCs/>
+          <w:kern w:val="0"/>
+          <w14:ligatures w14:val="none"/>
+        </w:rPr>
+        <w:t>501, 'Ansh Sharma', 20, 'ansh21@gmail.com')</w:t>
+      </w:r>
+    </w:p>
+    <w:p>
+      <w:pPr>
+        <w:rPr>
+          <w:rFonts w:ascii="Times New Roman" w:eastAsia="Times New Roman" w:hAnsi="Times New Roman" w:cs="Times New Roman"/>
+          <w:bCs/>
+          <w:kern w:val="0"/>
+          <w14:ligatures w14:val="none"/>
+        </w:rPr>
+      </w:pPr>
+    </w:p>
+    <w:p>
+      <w:pPr>
+        <w:rPr>
+          <w:rFonts w:ascii="Times New Roman" w:eastAsia="Times New Roman" w:hAnsi="Times New Roman" w:cs="Times New Roman"/>
+          <w:bCs/>
+          <w:kern w:val="0"/>
+          <w14:ligatures w14:val="none"/>
+        </w:rPr>
+      </w:pPr>
+      <w:r>
+        <w:rPr>
+          <w:rFonts w:ascii="Times New Roman" w:eastAsia="Times New Roman" w:hAnsi="Times New Roman" w:cs="Times New Roman"/>
+          <w:bCs/>
+          <w:kern w:val="0"/>
+          <w14:ligatures w14:val="none"/>
+        </w:rPr>
+        <w:t xml:space="preserve">INSERT INTO LIBRARY_VISITORS </w:t>
+      </w:r>
+      <w:proofErr w:type="gramStart"/>
+      <w:r>
+        <w:rPr>
+          <w:rFonts w:ascii="Times New Roman" w:eastAsia="Times New Roman" w:hAnsi="Times New Roman" w:cs="Times New Roman"/>
+          <w:bCs/>
+          <w:kern w:val="0"/>
+          <w14:ligatures w14:val="none"/>
+        </w:rPr>
+        <w:t>VALUES(</w:t>
+      </w:r>
+      <w:proofErr w:type="gramEnd"/>
+      <w:r>
+        <w:rPr>
+          <w:rFonts w:ascii="Times New Roman" w:eastAsia="Times New Roman" w:hAnsi="Times New Roman" w:cs="Times New Roman"/>
+          <w:bCs/>
+          <w:kern w:val="0"/>
+          <w14:ligatures w14:val="none"/>
+        </w:rPr>
+        <w:t>502, 'Nitin', 19, 'nitin2@gmail.com')</w:t>
+      </w:r>
+    </w:p>
+    <w:p>
+      <w:pPr>
+        <w:rPr>
+          <w:rFonts w:ascii="Times New Roman" w:eastAsia="Times New Roman" w:hAnsi="Times New Roman" w:cs="Times New Roman"/>
+          <w:bCs/>
+          <w:kern w:val="0"/>
+          <w14:ligatures w14:val="none"/>
+        </w:rPr>
+      </w:pPr>
+    </w:p>
+    <w:p>
+      <w:pPr>
+        <w:rPr>
+          <w:rFonts w:ascii="Times New Roman" w:eastAsia="Times New Roman" w:hAnsi="Times New Roman" w:cs="Times New Roman"/>
+          <w:bCs/>
+          <w:kern w:val="0"/>
+          <w14:ligatures w14:val="none"/>
+        </w:rPr>
+      </w:pPr>
+      <w:r>
+        <w:rPr>
+          <w:rFonts w:ascii="Times New Roman" w:eastAsia="Times New Roman" w:hAnsi="Times New Roman" w:cs="Times New Roman"/>
+          <w:bCs/>
+          <w:kern w:val="0"/>
+          <w14:ligatures w14:val="none"/>
+        </w:rPr>
+        <w:t>CREATE TABLE BOOK_</w:t>
+      </w:r>
+      <w:proofErr w:type="gramStart"/>
+      <w:r>
+        <w:rPr>
+          <w:rFonts w:ascii="Times New Roman" w:eastAsia="Times New Roman" w:hAnsi="Times New Roman" w:cs="Times New Roman"/>
+          <w:bCs/>
+          <w:kern w:val="0"/>
+          <w14:ligatures w14:val="none"/>
+        </w:rPr>
+        <w:t>ISSUE(</w:t>
+      </w:r>
+      <w:proofErr w:type="gramEnd"/>
     </w:p>
     <w:p>
       <w:pPr>
@@ -1240,7 +1444,27 @@
           <w:kern w:val="0"/>
           <w14:ligatures w14:val="none"/>
         </w:rPr>
-        <w:t>INSERT INTO BOOK_ISSUE VALUES(101, 501, 1)</w:t>
+        <w:t xml:space="preserve">INSERT INTO BOOK_ISSUE </w:t>
+      </w:r>
+      <w:proofErr w:type="gramStart"/>
+      <w:r>
+        <w:rPr>
+          <w:rFonts w:ascii="Times New Roman" w:eastAsia="Times New Roman" w:hAnsi="Times New Roman" w:cs="Times New Roman"/>
+          <w:bCs/>
+          <w:kern w:val="0"/>
+          <w14:ligatures w14:val="none"/>
+        </w:rPr>
+        <w:t>VALUES(</w:t>
+      </w:r>
+      <w:proofErr w:type="gramEnd"/>
+      <w:r>
+        <w:rPr>
+          <w:rFonts w:ascii="Times New Roman" w:eastAsia="Times New Roman" w:hAnsi="Times New Roman" w:cs="Times New Roman"/>
+          <w:bCs/>
+          <w:kern w:val="0"/>
+          <w14:ligatures w14:val="none"/>
+        </w:rPr>
+        <w:t>101, 501, 1)</w:t>
       </w:r>
     </w:p>
     <w:p>
@@ -1346,26 +1570,106 @@
           <w:kern w:val="0"/>
           <w14:ligatures w14:val="none"/>
         </w:rPr>
-        <w:t>GRANT SELECT,INSERT,DELETE,UPDATE ON BOOKS TO LIBRARIAN</w:t>
-      </w:r>
-    </w:p>
-    <w:p>
-      <w:pPr>
-        <w:rPr>
-          <w:rFonts w:ascii="Times New Roman" w:eastAsia="Times New Roman" w:hAnsi="Times New Roman" w:cs="Times New Roman"/>
-          <w:bCs/>
-          <w:kern w:val="0"/>
-          <w14:ligatures w14:val="none"/>
-        </w:rPr>
-      </w:pPr>
-      <w:r>
-        <w:rPr>
-          <w:rFonts w:ascii="Times New Roman" w:eastAsia="Times New Roman" w:hAnsi="Times New Roman" w:cs="Times New Roman"/>
-          <w:bCs/>
-          <w:kern w:val="0"/>
-          <w14:ligatures w14:val="none"/>
-        </w:rPr>
-        <w:t>REVOKE SELECT,INSERT,DELETE,UPDATE ON BOOKS FROM LIBRARIAN</w:t>
+        <w:t xml:space="preserve">GRANT </w:t>
+      </w:r>
+      <w:proofErr w:type="gramStart"/>
+      <w:r>
+        <w:rPr>
+          <w:rFonts w:ascii="Times New Roman" w:eastAsia="Times New Roman" w:hAnsi="Times New Roman" w:cs="Times New Roman"/>
+          <w:bCs/>
+          <w:kern w:val="0"/>
+          <w14:ligatures w14:val="none"/>
+        </w:rPr>
+        <w:t>SELECT,INSERT</w:t>
+      </w:r>
+      <w:proofErr w:type="gramEnd"/>
+      <w:r>
+        <w:rPr>
+          <w:rFonts w:ascii="Times New Roman" w:eastAsia="Times New Roman" w:hAnsi="Times New Roman" w:cs="Times New Roman"/>
+          <w:bCs/>
+          <w:kern w:val="0"/>
+          <w14:ligatures w14:val="none"/>
+        </w:rPr>
+        <w:t>,</w:t>
+      </w:r>
+      <w:proofErr w:type="gramStart"/>
+      <w:r>
+        <w:rPr>
+          <w:rFonts w:ascii="Times New Roman" w:eastAsia="Times New Roman" w:hAnsi="Times New Roman" w:cs="Times New Roman"/>
+          <w:bCs/>
+          <w:kern w:val="0"/>
+          <w14:ligatures w14:val="none"/>
+        </w:rPr>
+        <w:t>DELETE,UPDATE</w:t>
+      </w:r>
+      <w:proofErr w:type="gramEnd"/>
+      <w:r>
+        <w:rPr>
+          <w:rFonts w:ascii="Times New Roman" w:eastAsia="Times New Roman" w:hAnsi="Times New Roman" w:cs="Times New Roman"/>
+          <w:bCs/>
+          <w:kern w:val="0"/>
+          <w14:ligatures w14:val="none"/>
+        </w:rPr>
+        <w:t xml:space="preserve"> ON BOOKS TO LIBRARIAN</w:t>
+      </w:r>
+    </w:p>
+    <w:p>
+      <w:pPr>
+        <w:rPr>
+          <w:rFonts w:ascii="Times New Roman" w:eastAsia="Times New Roman" w:hAnsi="Times New Roman" w:cs="Times New Roman"/>
+          <w:bCs/>
+          <w:kern w:val="0"/>
+          <w14:ligatures w14:val="none"/>
+        </w:rPr>
+      </w:pPr>
+      <w:r>
+        <w:rPr>
+          <w:rFonts w:ascii="Times New Roman" w:eastAsia="Times New Roman" w:hAnsi="Times New Roman" w:cs="Times New Roman"/>
+          <w:bCs/>
+          <w:kern w:val="0"/>
+          <w14:ligatures w14:val="none"/>
+        </w:rPr>
+        <w:t xml:space="preserve">REVOKE </w:t>
+      </w:r>
+      <w:proofErr w:type="gramStart"/>
+      <w:r>
+        <w:rPr>
+          <w:rFonts w:ascii="Times New Roman" w:eastAsia="Times New Roman" w:hAnsi="Times New Roman" w:cs="Times New Roman"/>
+          <w:bCs/>
+          <w:kern w:val="0"/>
+          <w14:ligatures w14:val="none"/>
+        </w:rPr>
+        <w:t>SELECT,INSERT</w:t>
+      </w:r>
+      <w:proofErr w:type="gramEnd"/>
+      <w:r>
+        <w:rPr>
+          <w:rFonts w:ascii="Times New Roman" w:eastAsia="Times New Roman" w:hAnsi="Times New Roman" w:cs="Times New Roman"/>
+          <w:bCs/>
+          <w:kern w:val="0"/>
+          <w14:ligatures w14:val="none"/>
+        </w:rPr>
+        <w:t>,</w:t>
+      </w:r>
+      <w:proofErr w:type="gramStart"/>
+      <w:r>
+        <w:rPr>
+          <w:rFonts w:ascii="Times New Roman" w:eastAsia="Times New Roman" w:hAnsi="Times New Roman" w:cs="Times New Roman"/>
+          <w:bCs/>
+          <w:kern w:val="0"/>
+          <w14:ligatures w14:val="none"/>
+        </w:rPr>
+        <w:t>DELETE,UPDATE</w:t>
+      </w:r>
+      <w:proofErr w:type="gramEnd"/>
+      <w:r>
+        <w:rPr>
+          <w:rFonts w:ascii="Times New Roman" w:eastAsia="Times New Roman" w:hAnsi="Times New Roman" w:cs="Times New Roman"/>
+          <w:bCs/>
+          <w:kern w:val="0"/>
+          <w14:ligatures w14:val="none"/>
+        </w:rPr>
+        <w:t xml:space="preserve"> ON BOOKS FROM LIBRARIAN</w:t>
       </w:r>
     </w:p>
     <w:p>

</xml_diff>